<commit_message>
Re-render course-outline PDF/DOCX with developer framing
Rebuilds the standalone outline from the reframed source so the downloadable
PDF/DOCX credit "Course developer: Dr. M. Ehsan Karim" and defer the course
instructor + contact to Canvas (previously listed Ehsan as Course Instructor
with his email). Verified: 0 instructor-email hits; bio is "About the Course
Developer". The outline remains as a reusable template for adopting instructors.
</commit_message>
<xml_diff>
--- a/syllabus/SPPH-381H-Course-Outline-v4.docx
+++ b/syllabus/SPPH-381H-Course-Outline-v4.docx
@@ -634,8 +634,8 @@
         <w:tblLook w:firstRow="0" w:lastRow="0" w:firstColumn="0" w:lastColumn="0" w:noHBand="0" w:noVBand="0" w:val="0000"/>
       </w:tblPr>
       <w:tblGrid>
-        <w:gridCol w:w="880"/>
-        <w:gridCol w:w="7040"/>
+        <w:gridCol w:w="1959"/>
+        <w:gridCol w:w="5960"/>
       </w:tblGrid>
       <w:tr>
         <w:tc>
@@ -646,19 +646,19 @@
               <w:jc w:val="right"/>
             </w:pPr>
             <w:r>
-              <w:t xml:space="preserve">Role:</w:t>
-            </w:r>
-          </w:p>
-        </w:tc>
-        <w:tc>
-          <w:tcPr/>
-          <w:p>
-            <w:pPr>
-              <w:pStyle w:val="Compact"/>
-              <w:jc w:val="left"/>
-            </w:pPr>
-            <w:r>
-              <w:t xml:space="preserve">Course Instructor</w:t>
+              <w:t xml:space="preserve">Course developer:</w:t>
+            </w:r>
+          </w:p>
+        </w:tc>
+        <w:tc>
+          <w:tcPr/>
+          <w:p>
+            <w:pPr>
+              <w:pStyle w:val="Compact"/>
+              <w:jc w:val="left"/>
+            </w:pPr>
+            <w:r>
+              <w:t xml:space="preserve">Dr. M. Ehsan Karim</w:t>
             </w:r>
           </w:p>
         </w:tc>
@@ -672,19 +672,19 @@
               <w:jc w:val="right"/>
             </w:pPr>
             <w:r>
-              <w:t xml:space="preserve">Name:</w:t>
-            </w:r>
-          </w:p>
-        </w:tc>
-        <w:tc>
-          <w:tcPr/>
-          <w:p>
-            <w:pPr>
-              <w:pStyle w:val="Compact"/>
-              <w:jc w:val="left"/>
-            </w:pPr>
-            <w:r>
-              <w:t xml:space="preserve">Dr. M. Ehsan Karim</w:t>
+              <w:t xml:space="preserve">Affiliation:</w:t>
+            </w:r>
+          </w:p>
+        </w:tc>
+        <w:tc>
+          <w:tcPr/>
+          <w:p>
+            <w:pPr>
+              <w:pStyle w:val="Compact"/>
+              <w:jc w:val="left"/>
+            </w:pPr>
+            <w:r>
+              <w:t xml:space="preserve">School of Population and Public Health, University of British Columbia</w:t>
             </w:r>
           </w:p>
         </w:tc>
@@ -698,19 +698,19 @@
               <w:jc w:val="right"/>
             </w:pPr>
             <w:r>
-              <w:t xml:space="preserve">Email:</w:t>
-            </w:r>
-          </w:p>
-        </w:tc>
-        <w:tc>
-          <w:tcPr/>
-          <w:p>
-            <w:pPr>
-              <w:pStyle w:val="Compact"/>
-              <w:jc w:val="left"/>
-            </w:pPr>
-            <w:r>
-              <w:t xml:space="preserve">ehsan.karim@ubc.ca</w:t>
+              <w:t xml:space="preserve">Course instructor:</w:t>
+            </w:r>
+          </w:p>
+        </w:tc>
+        <w:tc>
+          <w:tcPr/>
+          <w:p>
+            <w:pPr>
+              <w:pStyle w:val="Compact"/>
+              <w:jc w:val="left"/>
+            </w:pPr>
+            <w:r>
+              <w:t xml:space="preserve">See Canvas for the instructor teaching your offering</w:t>
             </w:r>
           </w:p>
         </w:tc>
@@ -724,45 +724,19 @@
               <w:jc w:val="right"/>
             </w:pPr>
             <w:r>
-              <w:t xml:space="preserve">Office:</w:t>
-            </w:r>
-          </w:p>
-        </w:tc>
-        <w:tc>
-          <w:tcPr/>
-          <w:p>
-            <w:pPr>
-              <w:pStyle w:val="Compact"/>
-              <w:jc w:val="left"/>
-            </w:pPr>
-            <w:r>
-              <w:t xml:space="preserve">Appointments by request</w:t>
-            </w:r>
-          </w:p>
-        </w:tc>
-      </w:tr>
-      <w:tr>
-        <w:tc>
-          <w:tcPr/>
-          <w:p>
-            <w:pPr>
-              <w:pStyle w:val="Compact"/>
-              <w:jc w:val="right"/>
-            </w:pPr>
-            <w:r>
-              <w:t xml:space="preserve">Hours:</w:t>
-            </w:r>
-          </w:p>
-        </w:tc>
-        <w:tc>
-          <w:tcPr/>
-          <w:p>
-            <w:pPr>
-              <w:pStyle w:val="Compact"/>
-              <w:jc w:val="left"/>
-            </w:pPr>
-            <w:r>
-              <w:t xml:space="preserve">Weekly instructor and TA support times will be posted on Canvas</w:t>
+              <w:t xml:space="preserve">Contact &amp; office hours:</w:t>
+            </w:r>
+          </w:p>
+        </w:tc>
+        <w:tc>
+          <w:tcPr/>
+          <w:p>
+            <w:pPr>
+              <w:pStyle w:val="Compact"/>
+              <w:jc w:val="left"/>
+            </w:pPr>
+            <w:r>
+              <w:t xml:space="preserve">Instructor and TA contact details and support times are posted on Canvas</w:t>
             </w:r>
           </w:p>
         </w:tc>
@@ -798,13 +772,13 @@
         <w:t xml:space="preserve">TBA. To communicate with the computing TA, attend weekly classes and specified drop-in hours (as announced in Canvas).</w:t>
       </w:r>
     </w:p>
-    <w:bookmarkStart w:id="26" w:name="instructor-biographical-statement"/>
+    <w:bookmarkStart w:id="26" w:name="about-the-course-developer"/>
     <w:p>
       <w:pPr>
         <w:pStyle w:val="Heading3"/>
       </w:pPr>
       <w:r>
-        <w:t xml:space="preserve">Instructor Biographical Statement</w:t>
+        <w:t xml:space="preserve">About the Course Developer</w:t>
       </w:r>
     </w:p>
     <w:p>

</xml_diff>